<commit_message>
Commit of entire project
</commit_message>
<xml_diff>
--- a/Documentation/Ideation Phase(1)/Define the Problem Statements (1).docx
+++ b/Documentation/Ideation Phase(1)/Define the Problem Statements (1).docx
@@ -341,16 +341,16 @@
           <w:szCs w:val="24"/>
         </w:rPr>
         <w:drawing>
-          <wp:anchor distT="0" distB="0" distL="114300" distR="114300" simplePos="0" relativeHeight="251658240" behindDoc="0" locked="0" layoutInCell="1" allowOverlap="1" wp14:anchorId="0B0A9A5C" wp14:editId="24435F79">
+          <wp:anchor distT="0" distB="0" distL="114300" distR="114300" simplePos="0" relativeHeight="251658240" behindDoc="0" locked="0" layoutInCell="1" allowOverlap="1" wp14:anchorId="0B0A9A5C" wp14:editId="46343728">
             <wp:simplePos x="0" y="0"/>
             <wp:positionH relativeFrom="margin">
-              <wp:align>left</wp:align>
+              <wp:posOffset>-615950</wp:posOffset>
             </wp:positionH>
             <wp:positionV relativeFrom="paragraph">
-              <wp:posOffset>747395</wp:posOffset>
+              <wp:posOffset>817245</wp:posOffset>
             </wp:positionV>
-            <wp:extent cx="5886450" cy="2355850"/>
-            <wp:effectExtent l="0" t="0" r="0" b="6350"/>
+            <wp:extent cx="6996430" cy="2800350"/>
+            <wp:effectExtent l="0" t="0" r="0" b="0"/>
             <wp:wrapSquare wrapText="bothSides"/>
             <wp:docPr id="636423246" name="Picture 1"/>
             <wp:cNvGraphicFramePr>
@@ -378,7 +378,7 @@
                   <pic:spPr>
                     <a:xfrm>
                       <a:off x="0" y="0"/>
-                      <a:ext cx="5886450" cy="2355850"/>
+                      <a:ext cx="6996430" cy="2800350"/>
                     </a:xfrm>
                     <a:prstGeom prst="rect">
                       <a:avLst/>
@@ -387,6 +387,12 @@
                 </pic:pic>
               </a:graphicData>
             </a:graphic>
+            <wp14:sizeRelH relativeFrom="margin">
+              <wp14:pctWidth>0</wp14:pctWidth>
+            </wp14:sizeRelH>
+            <wp14:sizeRelV relativeFrom="margin">
+              <wp14:pctHeight>0</wp14:pctHeight>
+            </wp14:sizeRelV>
           </wp:anchor>
         </w:drawing>
       </w:r>
@@ -704,6 +710,7 @@
                 <w:sz w:val="24"/>
                 <w:szCs w:val="24"/>
               </w:rPr>
+              <w:lastRenderedPageBreak/>
               <w:t>PS-1</w:t>
             </w:r>
           </w:p>
@@ -857,7 +864,6 @@
                 <w:sz w:val="24"/>
                 <w:szCs w:val="24"/>
               </w:rPr>
-              <w:lastRenderedPageBreak/>
               <w:t>PS-2</w:t>
             </w:r>
           </w:p>

</xml_diff>